<commit_message>
P2: added github link
</commit_message>
<xml_diff>
--- a/Project 2/Reports/P2 Final Report.docx
+++ b/Project 2/Reports/P2 Final Report.docx
@@ -154,23 +154,7 @@
           <w:sz w:val="22"/>
           <w:szCs w:val="22"/>
         </w:rPr>
-        <w:t xml:space="preserve"> (</w:t>
-      </w:r>
-      <w:r>
-        <w:rPr>
-          <w:rFonts w:ascii="Verdana" w:hAnsi="Verdana"/>
-          <w:sz w:val="22"/>
-          <w:szCs w:val="22"/>
-        </w:rPr>
-        <w:t>IL-6, TNF-α, MCP-1, and Eotaxin-1</w:t>
-      </w:r>
-      <w:r>
-        <w:rPr>
-          <w:rFonts w:ascii="Verdana" w:hAnsi="Verdana"/>
-          <w:sz w:val="22"/>
-          <w:szCs w:val="22"/>
-        </w:rPr>
-        <w:t>)</w:t>
+        <w:t xml:space="preserve"> (IL-6, TNF-α, MCP-1, and Eotaxin-1)</w:t>
       </w:r>
       <w:r>
         <w:rPr>
@@ -533,25 +517,7 @@
           <w:sz w:val="22"/>
           <w:szCs w:val="22"/>
         </w:rPr>
-        <w:t xml:space="preserve">Multiple linear regression models will include the main effect of each inflammatory marker, the main effect of amyloid SUVR, and their multiplicative interaction term, with one-year change scores as outcomes. Both the cytokine and amyloid SUVR variables will be </w:t>
-      </w:r>
-      <w:proofErr w:type="gramStart"/>
-      <w:r>
-        <w:rPr>
-          <w:rFonts w:ascii="Verdana" w:hAnsi="Verdana"/>
-          <w:sz w:val="22"/>
-          <w:szCs w:val="22"/>
-        </w:rPr>
-        <w:t>mean-centered</w:t>
-      </w:r>
-      <w:proofErr w:type="gramEnd"/>
-      <w:r>
-        <w:rPr>
-          <w:rFonts w:ascii="Verdana" w:hAnsi="Verdana"/>
-          <w:sz w:val="22"/>
-          <w:szCs w:val="22"/>
-        </w:rPr>
-        <w:t xml:space="preserve"> prior to computing the interaction term to reduce multicollinearity and facilitate interpretation of main effects. The model therefore </w:t>
+        <w:t xml:space="preserve">Multiple linear regression models will include the main effect of each inflammatory marker, the main effect of amyloid SUVR, and their multiplicative interaction term, with one-year change scores as outcomes. Both the cytokine and amyloid SUVR variables will be mean-centered prior to computing the interaction term to reduce multicollinearity and facilitate interpretation of main effects. The model therefore </w:t>
       </w:r>
       <w:r>
         <w:rPr>
@@ -2745,25 +2711,7 @@
           <w:sz w:val="22"/>
           <w:szCs w:val="22"/>
         </w:rPr>
-        <w:t xml:space="preserve"> function, treating the cytokine × amyloid SUVR interaction term as the test predictor (q = 1) added over and above all main effects and covariates. The number of control predictors was set to p = 12, reflecting the 10 covariates from Aim 1 plus the two main effects (cytokine and amyloid SUVR) that must be retained in the model alongside the interaction term. No preliminary data </w:t>
-      </w:r>
-      <w:proofErr w:type="gramStart"/>
-      <w:r>
-        <w:rPr>
-          <w:rFonts w:ascii="Verdana" w:hAnsi="Verdana"/>
-          <w:sz w:val="22"/>
-          <w:szCs w:val="22"/>
-        </w:rPr>
-        <w:t>were</w:t>
-      </w:r>
-      <w:proofErr w:type="gramEnd"/>
-      <w:r>
-        <w:rPr>
-          <w:rFonts w:ascii="Verdana" w:hAnsi="Verdana"/>
-          <w:sz w:val="22"/>
-          <w:szCs w:val="22"/>
-        </w:rPr>
-        <w:t xml:space="preserve"> available to estimate the interaction effect size directly, as amyloid SUVR was not measured in the preliminary sample. We therefore solved for the minimum detectable partial correlation at 80% power given N = 175, p = 12, q = 1, and α = 0.05. The minimum detectable partial correlation was pc = 0.21, indicating that the proposed sample of 175 participants is adequately powered to detect small-to-moderate </w:t>
+        <w:t xml:space="preserve"> function, treating the cytokine × amyloid SUVR interaction term as the test predictor (q = 1) added over and above all main effects and covariates. The number of control predictors was set to p = 12, reflecting the 10 covariates from Aim 1 plus the two main effects (cytokine and amyloid SUVR) that must be retained in the model alongside the interaction term. No preliminary data were available to estimate the interaction effect size directly, as amyloid SUVR was not measured in the preliminary sample. We therefore solved for the minimum detectable partial correlation at 80% power given N = 175, p = 12, q = 1, and α = 0.05. The minimum detectable partial correlation was pc = 0.21, indicating that the proposed sample of 175 participants is adequately powered to detect small-to-moderate </w:t>
       </w:r>
       <w:r>
         <w:rPr>
@@ -2773,6 +2721,62 @@
         </w:rPr>
         <w:lastRenderedPageBreak/>
         <w:t>interaction effects between inflammatory markers and amyloid deposition. Whether the true interaction effect meets this threshold cannot be determined from available pilot data; this represents a reasonable target given the hypothesis that the combination of elevated inflammation and high amyloid burden produces an exaggerated decline beyond either factor alone.</w:t>
+      </w:r>
+    </w:p>
+    <w:p>
+      <w:pPr>
+        <w:rPr>
+          <w:rFonts w:ascii="Verdana" w:hAnsi="Verdana"/>
+          <w:sz w:val="22"/>
+          <w:szCs w:val="22"/>
+        </w:rPr>
+      </w:pPr>
+    </w:p>
+    <w:p>
+      <w:pPr>
+        <w:rPr>
+          <w:rFonts w:ascii="Verdana" w:hAnsi="Verdana"/>
+          <w:sz w:val="22"/>
+          <w:szCs w:val="22"/>
+          <w:u w:val="single"/>
+        </w:rPr>
+      </w:pPr>
+      <w:r>
+        <w:rPr>
+          <w:rFonts w:ascii="Verdana" w:hAnsi="Verdana"/>
+          <w:sz w:val="22"/>
+          <w:szCs w:val="22"/>
+          <w:u w:val="single"/>
+        </w:rPr>
+        <w:t>Reproducible Research</w:t>
+      </w:r>
+    </w:p>
+    <w:p>
+      <w:pPr>
+        <w:rPr>
+          <w:rFonts w:ascii="Verdana" w:hAnsi="Verdana"/>
+          <w:sz w:val="22"/>
+          <w:szCs w:val="22"/>
+        </w:rPr>
+      </w:pPr>
+      <w:hyperlink r:id="rId5" w:history="1">
+        <w:r>
+          <w:rPr>
+            <w:rStyle w:val="Hyperlink"/>
+            <w:rFonts w:ascii="Verdana" w:hAnsi="Verdana"/>
+            <w:sz w:val="22"/>
+            <w:szCs w:val="22"/>
+          </w:rPr>
+          <w:t>https://github.com/asteinwand/BIOS6624.git</w:t>
+        </w:r>
+      </w:hyperlink>
+      <w:r>
+        <w:rPr>
+          <w:rFonts w:ascii="Verdana" w:hAnsi="Verdana"/>
+          <w:sz w:val="22"/>
+          <w:szCs w:val="22"/>
+        </w:rPr>
+        <w:t xml:space="preserve"> </w:t>
       </w:r>
     </w:p>
     <w:sectPr>
@@ -3511,6 +3515,7 @@
   <w:style w:type="character" w:default="1" w:styleId="DefaultParagraphFont">
     <w:name w:val="Default Paragraph Font"/>
     <w:uiPriority w:val="1"/>
+    <w:semiHidden/>
     <w:unhideWhenUsed/>
   </w:style>
   <w:style w:type="table" w:default="1" w:styleId="TableNormal">
@@ -3824,6 +3829,29 @@
       <w:spacing w:val="5"/>
     </w:rPr>
   </w:style>
+  <w:style w:type="character" w:styleId="Hyperlink">
+    <w:name w:val="Hyperlink"/>
+    <w:basedOn w:val="DefaultParagraphFont"/>
+    <w:uiPriority w:val="99"/>
+    <w:unhideWhenUsed/>
+    <w:rsid w:val="00FB6E31"/>
+    <w:rPr>
+      <w:color w:val="467886" w:themeColor="hyperlink"/>
+      <w:u w:val="single"/>
+    </w:rPr>
+  </w:style>
+  <w:style w:type="character" w:styleId="UnresolvedMention">
+    <w:name w:val="Unresolved Mention"/>
+    <w:basedOn w:val="DefaultParagraphFont"/>
+    <w:uiPriority w:val="99"/>
+    <w:semiHidden/>
+    <w:unhideWhenUsed/>
+    <w:rsid w:val="00FB6E31"/>
+    <w:rPr>
+      <w:color w:val="605E5C"/>
+      <w:shd w:val="clear" w:color="auto" w:fill="E1DFDD"/>
+    </w:rPr>
+  </w:style>
 </w:styles>
 </file>
 

</xml_diff>